<commit_message>
update MODEL_METHODOLOGY.md and backend simulation files
</commit_message>
<xml_diff>
--- a/docs/PowerTrain_Optimizer_User_Guide.docx
+++ b/docs/PowerTrain_Optimizer_User_Guide.docx
@@ -45,7 +45,7 @@
         <w:br/>
         <w:t>for Data Centre · Solar · Wind · BESS · Grid</w:t>
         <w:br/>
-        <w:t>Includes: portable EXE · LAN sharing · Save Project (.pto.zip) · architecture asset selection · compact Indian number format · on-screen parameter help</w:t>
+        <w:t>Includes: portable EXE · LAN sharing · Save Project (.pto.zip) · architecture asset selection · simplified BESS · compact Indian number format · on-screen parameter help</w:t>
       </w:r>
     </w:p>
     <w:p>
@@ -1550,6 +1550,38 @@
                 <w:b w:val="0"/>
                 <w:sz w:val="18"/>
               </w:rPr>
+              <w:t>Simplified BESS inputs</w:t>
+            </w:r>
+          </w:p>
+        </w:tc>
+        <w:tc>
+          <w:tcPr>
+            <w:tcW w:type="dxa" w:w="4320"/>
+          </w:tcPr>
+          <w:p>
+            <w:r>
+              <w:rPr>
+                <w:rFonts w:ascii="Calibri" w:hAnsi="Calibri" w:eastAsia="Calibri"/>
+                <w:b w:val="0"/>
+                <w:sz w:val="18"/>
+              </w:rPr>
+              <w:t>Charge efficiency, Discharge efficiency, Max charge power and Max discharge power are removed. BESS power (MW) is both the charge and discharge limit; conversion efficiency is ideal (100%). BESS losses MWh = 0. SOC_t = SOC_(t−1) + Charge_t − Discharge_t within min/max SOC.</w:t>
+            </w:r>
+          </w:p>
+        </w:tc>
+      </w:tr>
+      <w:tr>
+        <w:tc>
+          <w:tcPr>
+            <w:tcW w:type="dxa" w:w="4320"/>
+          </w:tcPr>
+          <w:p>
+            <w:r>
+              <w:rPr>
+                <w:rFonts w:ascii="Calibri" w:hAnsi="Calibri" w:eastAsia="Calibri"/>
+                <w:b w:val="0"/>
+                <w:sz w:val="18"/>
+              </w:rPr>
               <w:t>On-screen parameter help</w:t>
             </w:r>
           </w:p>
@@ -3437,7 +3469,7 @@
           <w:i w:val="0"/>
           <w:sz w:val="22"/>
         </w:rPr>
-        <w:t>Direct editor for battery power/energy, SOC limits, efficiencies, degradation, CAPEX/OPEX and replacement.</w:t>
+        <w:t>Direct editor for battery power (MW) and energy (MWh), SOC window (initial/min/max), degradation, CAPEX/OPEX, replacement and allow-grid-charge. Power rating is both max charge and max discharge; charge/discharge efficiencies are not user inputs (modelled as 100%).</w:t>
       </w:r>
     </w:p>
     <w:p>
@@ -11611,7 +11643,7 @@
           <w:i w:val="0"/>
           <w:sz w:val="22"/>
         </w:rPr>
-        <w:t>Physical battery model with SOC limits, one-way efficiencies, and renewable-origin tracking for ESO.</w:t>
+        <w:t>Physical battery model with power rating (caps both charge and discharge), energy capacity, SOC window, and renewable-origin tracking for ESO. Conversion efficiency is ideal (100%) — charge/discharge efficiency and separate max charge/discharge power inputs are not used.</w:t>
       </w:r>
     </w:p>
     <w:tbl>
@@ -11776,7 +11808,7 @@
                 <w:b w:val="0"/>
                 <w:sz w:val="18"/>
               </w:rPr>
-              <w:t>BESS power rating (charge and discharge unless overridden).</w:t>
+              <w:t>BESS power rating — used as both maximum charge and discharge power.</w:t>
             </w:r>
           </w:p>
         </w:tc>
@@ -12085,391 +12117,6 @@
                 <w:sz w:val="18"/>
               </w:rPr>
               <w:t>Upper SOC bound.</w:t>
-            </w:r>
-          </w:p>
-        </w:tc>
-      </w:tr>
-      <w:tr>
-        <w:tc>
-          <w:tcPr>
-            <w:tcW w:type="dxa" w:w="2304"/>
-          </w:tcPr>
-          <w:p>
-            <w:r>
-              <w:rPr>
-                <w:rFonts w:ascii="Calibri" w:hAnsi="Calibri" w:eastAsia="Calibri"/>
-                <w:b w:val="0"/>
-                <w:sz w:val="18"/>
-              </w:rPr>
-              <w:t>charge efficiency pct</w:t>
-            </w:r>
-          </w:p>
-        </w:tc>
-        <w:tc>
-          <w:tcPr>
-            <w:tcW w:type="dxa" w:w="1584"/>
-          </w:tcPr>
-          <w:p>
-            <w:r>
-              <w:rPr>
-                <w:rFonts w:ascii="Calibri" w:hAnsi="Calibri" w:eastAsia="Calibri"/>
-                <w:b w:val="0"/>
-                <w:sz w:val="18"/>
-              </w:rPr>
-              <w:t>95.0</w:t>
-            </w:r>
-          </w:p>
-        </w:tc>
-        <w:tc>
-          <w:tcPr>
-            <w:tcW w:type="dxa" w:w="1008"/>
-          </w:tcPr>
-          <w:p>
-            <w:r>
-              <w:rPr>
-                <w:rFonts w:ascii="Calibri" w:hAnsi="Calibri" w:eastAsia="Calibri"/>
-                <w:b w:val="0"/>
-                <w:sz w:val="18"/>
-              </w:rPr>
-              <w:t>%</w:t>
-            </w:r>
-          </w:p>
-        </w:tc>
-        <w:tc>
-          <w:tcPr>
-            <w:tcW w:type="dxa" w:w="1872"/>
-          </w:tcPr>
-          <w:p>
-            <w:r>
-              <w:rPr>
-                <w:rFonts w:ascii="Calibri" w:hAnsi="Calibri" w:eastAsia="Calibri"/>
-                <w:b w:val="0"/>
-                <w:sz w:val="18"/>
-              </w:rPr>
-              <w:t>DEFAULT_ASSUMPTION</w:t>
-            </w:r>
-          </w:p>
-        </w:tc>
-        <w:tc>
-          <w:tcPr>
-            <w:tcW w:type="dxa" w:w="4032"/>
-          </w:tcPr>
-          <w:p>
-            <w:r>
-              <w:rPr>
-                <w:rFonts w:ascii="Calibri" w:hAnsi="Calibri" w:eastAsia="Calibri"/>
-                <w:b w:val="0"/>
-                <w:sz w:val="18"/>
-              </w:rPr>
-              <w:t>One-way charging efficiency.</w:t>
-            </w:r>
-          </w:p>
-        </w:tc>
-      </w:tr>
-      <w:tr>
-        <w:tc>
-          <w:tcPr>
-            <w:tcW w:type="dxa" w:w="2304"/>
-          </w:tcPr>
-          <w:p>
-            <w:r>
-              <w:rPr>
-                <w:rFonts w:ascii="Calibri" w:hAnsi="Calibri" w:eastAsia="Calibri"/>
-                <w:b w:val="0"/>
-                <w:sz w:val="18"/>
-              </w:rPr>
-              <w:t>discharge efficiency pct</w:t>
-            </w:r>
-          </w:p>
-        </w:tc>
-        <w:tc>
-          <w:tcPr>
-            <w:tcW w:type="dxa" w:w="1584"/>
-          </w:tcPr>
-          <w:p>
-            <w:r>
-              <w:rPr>
-                <w:rFonts w:ascii="Calibri" w:hAnsi="Calibri" w:eastAsia="Calibri"/>
-                <w:b w:val="0"/>
-                <w:sz w:val="18"/>
-              </w:rPr>
-              <w:t>95.0</w:t>
-            </w:r>
-          </w:p>
-        </w:tc>
-        <w:tc>
-          <w:tcPr>
-            <w:tcW w:type="dxa" w:w="1008"/>
-          </w:tcPr>
-          <w:p>
-            <w:r>
-              <w:rPr>
-                <w:rFonts w:ascii="Calibri" w:hAnsi="Calibri" w:eastAsia="Calibri"/>
-                <w:b w:val="0"/>
-                <w:sz w:val="18"/>
-              </w:rPr>
-              <w:t>%</w:t>
-            </w:r>
-          </w:p>
-        </w:tc>
-        <w:tc>
-          <w:tcPr>
-            <w:tcW w:type="dxa" w:w="1872"/>
-          </w:tcPr>
-          <w:p>
-            <w:r>
-              <w:rPr>
-                <w:rFonts w:ascii="Calibri" w:hAnsi="Calibri" w:eastAsia="Calibri"/>
-                <w:b w:val="0"/>
-                <w:sz w:val="18"/>
-              </w:rPr>
-              <w:t>DEFAULT_ASSUMPTION</w:t>
-            </w:r>
-          </w:p>
-        </w:tc>
-        <w:tc>
-          <w:tcPr>
-            <w:tcW w:type="dxa" w:w="4032"/>
-          </w:tcPr>
-          <w:p>
-            <w:r>
-              <w:rPr>
-                <w:rFonts w:ascii="Calibri" w:hAnsi="Calibri" w:eastAsia="Calibri"/>
-                <w:b w:val="0"/>
-                <w:sz w:val="18"/>
-              </w:rPr>
-              <w:t>One-way discharging efficiency.</w:t>
-            </w:r>
-          </w:p>
-        </w:tc>
-      </w:tr>
-      <w:tr>
-        <w:tc>
-          <w:tcPr>
-            <w:tcW w:type="dxa" w:w="2304"/>
-          </w:tcPr>
-          <w:p>
-            <w:r>
-              <w:rPr>
-                <w:rFonts w:ascii="Calibri" w:hAnsi="Calibri" w:eastAsia="Calibri"/>
-                <w:b w:val="0"/>
-                <w:sz w:val="18"/>
-              </w:rPr>
-              <w:t>round trip efficiency pct</w:t>
-            </w:r>
-          </w:p>
-        </w:tc>
-        <w:tc>
-          <w:tcPr>
-            <w:tcW w:type="dxa" w:w="1584"/>
-          </w:tcPr>
-          <w:p>
-            <w:r>
-              <w:rPr>
-                <w:rFonts w:ascii="Calibri" w:hAnsi="Calibri" w:eastAsia="Calibri"/>
-                <w:b w:val="0"/>
-                <w:sz w:val="18"/>
-              </w:rPr>
-              <w:t>90.25</w:t>
-            </w:r>
-          </w:p>
-        </w:tc>
-        <w:tc>
-          <w:tcPr>
-            <w:tcW w:type="dxa" w:w="1008"/>
-          </w:tcPr>
-          <w:p>
-            <w:r>
-              <w:rPr>
-                <w:rFonts w:ascii="Calibri" w:hAnsi="Calibri" w:eastAsia="Calibri"/>
-                <w:b w:val="0"/>
-                <w:sz w:val="18"/>
-              </w:rPr>
-              <w:t>%</w:t>
-            </w:r>
-          </w:p>
-        </w:tc>
-        <w:tc>
-          <w:tcPr>
-            <w:tcW w:type="dxa" w:w="1872"/>
-          </w:tcPr>
-          <w:p>
-            <w:r>
-              <w:rPr>
-                <w:rFonts w:ascii="Calibri" w:hAnsi="Calibri" w:eastAsia="Calibri"/>
-                <w:b w:val="0"/>
-                <w:sz w:val="18"/>
-              </w:rPr>
-              <w:t>CALCULATED</w:t>
-            </w:r>
-          </w:p>
-        </w:tc>
-        <w:tc>
-          <w:tcPr>
-            <w:tcW w:type="dxa" w:w="4032"/>
-          </w:tcPr>
-          <w:p>
-            <w:r>
-              <w:rPr>
-                <w:rFonts w:ascii="Calibri" w:hAnsi="Calibri" w:eastAsia="Calibri"/>
-                <w:b w:val="0"/>
-                <w:sz w:val="18"/>
-              </w:rPr>
-              <w:t>charge_efficiency × discharge_efficiency.</w:t>
-            </w:r>
-          </w:p>
-        </w:tc>
-      </w:tr>
-      <w:tr>
-        <w:tc>
-          <w:tcPr>
-            <w:tcW w:type="dxa" w:w="2304"/>
-          </w:tcPr>
-          <w:p>
-            <w:r>
-              <w:rPr>
-                <w:rFonts w:ascii="Calibri" w:hAnsi="Calibri" w:eastAsia="Calibri"/>
-                <w:b w:val="0"/>
-                <w:sz w:val="18"/>
-              </w:rPr>
-              <w:t>max charge mw</w:t>
-            </w:r>
-          </w:p>
-        </w:tc>
-        <w:tc>
-          <w:tcPr>
-            <w:tcW w:type="dxa" w:w="1584"/>
-          </w:tcPr>
-          <w:p>
-            <w:r>
-              <w:rPr>
-                <w:rFonts w:ascii="Calibri" w:hAnsi="Calibri" w:eastAsia="Calibri"/>
-                <w:b w:val="0"/>
-                <w:sz w:val="18"/>
-              </w:rPr>
-              <w:t>150.0</w:t>
-            </w:r>
-          </w:p>
-        </w:tc>
-        <w:tc>
-          <w:tcPr>
-            <w:tcW w:type="dxa" w:w="1008"/>
-          </w:tcPr>
-          <w:p>
-            <w:r>
-              <w:rPr>
-                <w:rFonts w:ascii="Calibri" w:hAnsi="Calibri" w:eastAsia="Calibri"/>
-                <w:b w:val="0"/>
-                <w:sz w:val="18"/>
-              </w:rPr>
-              <w:t>MW</w:t>
-            </w:r>
-          </w:p>
-        </w:tc>
-        <w:tc>
-          <w:tcPr>
-            <w:tcW w:type="dxa" w:w="1872"/>
-          </w:tcPr>
-          <w:p>
-            <w:r>
-              <w:rPr>
-                <w:rFonts w:ascii="Calibri" w:hAnsi="Calibri" w:eastAsia="Calibri"/>
-                <w:b w:val="0"/>
-                <w:sz w:val="18"/>
-              </w:rPr>
-              <w:t>DEFAULT_ASSUMPTION</w:t>
-            </w:r>
-          </w:p>
-        </w:tc>
-        <w:tc>
-          <w:tcPr>
-            <w:tcW w:type="dxa" w:w="4032"/>
-          </w:tcPr>
-          <w:p>
-            <w:r>
-              <w:rPr>
-                <w:rFonts w:ascii="Calibri" w:hAnsi="Calibri" w:eastAsia="Calibri"/>
-                <w:b w:val="0"/>
-                <w:sz w:val="18"/>
-              </w:rPr>
-              <w:t>Maximum charge power. Defaults to power rating.</w:t>
-            </w:r>
-          </w:p>
-        </w:tc>
-      </w:tr>
-      <w:tr>
-        <w:tc>
-          <w:tcPr>
-            <w:tcW w:type="dxa" w:w="2304"/>
-          </w:tcPr>
-          <w:p>
-            <w:r>
-              <w:rPr>
-                <w:rFonts w:ascii="Calibri" w:hAnsi="Calibri" w:eastAsia="Calibri"/>
-                <w:b w:val="0"/>
-                <w:sz w:val="18"/>
-              </w:rPr>
-              <w:t>max discharge mw</w:t>
-            </w:r>
-          </w:p>
-        </w:tc>
-        <w:tc>
-          <w:tcPr>
-            <w:tcW w:type="dxa" w:w="1584"/>
-          </w:tcPr>
-          <w:p>
-            <w:r>
-              <w:rPr>
-                <w:rFonts w:ascii="Calibri" w:hAnsi="Calibri" w:eastAsia="Calibri"/>
-                <w:b w:val="0"/>
-                <w:sz w:val="18"/>
-              </w:rPr>
-              <w:t>150.0</w:t>
-            </w:r>
-          </w:p>
-        </w:tc>
-        <w:tc>
-          <w:tcPr>
-            <w:tcW w:type="dxa" w:w="1008"/>
-          </w:tcPr>
-          <w:p>
-            <w:r>
-              <w:rPr>
-                <w:rFonts w:ascii="Calibri" w:hAnsi="Calibri" w:eastAsia="Calibri"/>
-                <w:b w:val="0"/>
-                <w:sz w:val="18"/>
-              </w:rPr>
-              <w:t>MW</w:t>
-            </w:r>
-          </w:p>
-        </w:tc>
-        <w:tc>
-          <w:tcPr>
-            <w:tcW w:type="dxa" w:w="1872"/>
-          </w:tcPr>
-          <w:p>
-            <w:r>
-              <w:rPr>
-                <w:rFonts w:ascii="Calibri" w:hAnsi="Calibri" w:eastAsia="Calibri"/>
-                <w:b w:val="0"/>
-                <w:sz w:val="18"/>
-              </w:rPr>
-              <w:t>DEFAULT_ASSUMPTION</w:t>
-            </w:r>
-          </w:p>
-        </w:tc>
-        <w:tc>
-          <w:tcPr>
-            <w:tcW w:type="dxa" w:w="4032"/>
-          </w:tcPr>
-          <w:p>
-            <w:r>
-              <w:rPr>
-                <w:rFonts w:ascii="Calibri" w:hAnsi="Calibri" w:eastAsia="Calibri"/>
-                <w:b w:val="0"/>
-                <w:sz w:val="18"/>
-              </w:rPr>
-              <w:t>Maximum discharge power. Defaults to power rating.</w:t>
             </w:r>
           </w:p>
         </w:tc>
@@ -22856,7 +22503,7 @@
                 <w:b w:val="0"/>
                 <w:sz w:val="18"/>
               </w:rPr>
-              <w:t>Derived automatically (e.g. base_load_mw, round-trip efficiency). Not directly editable.</w:t>
+              <w:t>Derived automatically (e.g. base_load_mw). Not directly editable.</w:t>
             </w:r>
           </w:p>
         </w:tc>
@@ -27034,6 +26681,20 @@
     </w:p>
     <w:p>
       <w:pPr>
+        <w:spacing w:after="120"/>
+      </w:pPr>
+      <w:r>
+        <w:rPr>
+          <w:rFonts w:ascii="Calibri" w:hAnsi="Calibri" w:eastAsia="Calibri"/>
+          <w:b w:val="0"/>
+          <w:i w:val="0"/>
+          <w:sz w:val="22"/>
+        </w:rPr>
+        <w:t>BESS modelling note: separate Charge efficiency, Discharge efficiency, Max charge power and Max discharge power inputs are removed. Charge and discharge are each limited by bess.power_mw. Conversion is ideal (η = 100%), so energy into storage equals energy out for a given throughput (aside from SOC window limits). Older projects drop the retired fields automatically when opened.</w:t>
+      </w:r>
+    </w:p>
+    <w:p>
+      <w:pPr>
         <w:pStyle w:val="ListNumber"/>
       </w:pPr>
       <w:r>
@@ -27055,7 +26716,7 @@
           <w:b w:val="0"/>
           <w:sz w:val="22"/>
         </w:rPr>
-        <w:t>Excess RE charges BESS (if capacity and SOC headroom allow), limited by max charge power and charge efficiency η_c.</w:t>
+        <w:t>Excess RE charges BESS (if capacity and SOC headroom allow), limited by BESS power rating (η = 100%).</w:t>
       </w:r>
     </w:p>
     <w:p>
@@ -27081,7 +26742,7 @@
           <w:b w:val="0"/>
           <w:sz w:val="22"/>
         </w:rPr>
-        <w:t>If load remains, BESS discharges (limited by max discharge, SOC above min, discharge efficiency η_d).</w:t>
+        <w:t>If load remains, BESS discharges (limited by power rating and SOC above min; η = 100%).</w:t>
       </w:r>
     </w:p>
     <w:p>
@@ -27148,7 +26809,7 @@
           <w:i w:val="0"/>
           <w:sz w:val="22"/>
         </w:rPr>
-        <w:t>SOC_t = SOC_(t−1) + Charge_t × η_c − Discharge_t / η_d, with SOC_min = min_soc_pct/100 × energy_mwh and SOC_max = max_soc_pct/100 × energy_mwh. Round-trip efficiency (CALCULATED) = charge_efficiency_pct × discharge_efficiency_pct / 100.</w:t>
+        <w:t>SOC_t = SOC_(t−1) + Charge_t − Discharge_t, with SOC_min = min_soc_pct/100 × energy_mwh and SOC_max = max_soc_pct/100 × energy_mwh. Charge and discharge power are both capped at bess.power_mw. Conversion efficiency is modelled as ideal (100%).</w:t>
       </w:r>
     </w:p>
     <w:p>
@@ -27162,6 +26823,322 @@
           <w:i w:val="0"/>
           <w:sz w:val="22"/>
         </w:rPr>
+        <w:t>User-editable BESS technical inputs (Setup → BESS):</w:t>
+      </w:r>
+    </w:p>
+    <w:tbl>
+      <w:tblPr>
+        <w:tblStyle w:val="TableGrid"/>
+        <w:tblW w:type="auto" w:w="0"/>
+        <w:tblLook w:firstColumn="1" w:firstRow="1" w:lastColumn="0" w:lastRow="0" w:noHBand="0" w:noVBand="1" w:val="04A0"/>
+      </w:tblPr>
+      <w:tblGrid>
+        <w:gridCol w:w="4320"/>
+        <w:gridCol w:w="4320"/>
+      </w:tblGrid>
+      <w:tr>
+        <w:tc>
+          <w:tcPr>
+            <w:tcW w:type="dxa" w:w="3168"/>
+          </w:tcPr>
+          <w:p>
+            <w:r>
+              <w:rPr>
+                <w:rFonts w:ascii="Calibri" w:hAnsi="Calibri" w:eastAsia="Calibri"/>
+                <w:b/>
+                <w:sz w:val="20"/>
+              </w:rPr>
+              <w:t>Parameter</w:t>
+            </w:r>
+          </w:p>
+        </w:tc>
+        <w:tc>
+          <w:tcPr>
+            <w:tcW w:type="dxa" w:w="6192"/>
+          </w:tcPr>
+          <w:p>
+            <w:r>
+              <w:rPr>
+                <w:rFonts w:ascii="Calibri" w:hAnsi="Calibri" w:eastAsia="Calibri"/>
+                <w:b/>
+                <w:sz w:val="20"/>
+              </w:rPr>
+              <w:t>Role</w:t>
+            </w:r>
+          </w:p>
+        </w:tc>
+      </w:tr>
+      <w:tr>
+        <w:tc>
+          <w:tcPr>
+            <w:tcW w:type="dxa" w:w="3168"/>
+          </w:tcPr>
+          <w:p>
+            <w:r>
+              <w:rPr>
+                <w:rFonts w:ascii="Calibri" w:hAnsi="Calibri" w:eastAsia="Calibri"/>
+                <w:b w:val="0"/>
+                <w:sz w:val="18"/>
+              </w:rPr>
+              <w:t>power_mw</w:t>
+            </w:r>
+          </w:p>
+        </w:tc>
+        <w:tc>
+          <w:tcPr>
+            <w:tcW w:type="dxa" w:w="6192"/>
+          </w:tcPr>
+          <w:p>
+            <w:r>
+              <w:rPr>
+                <w:rFonts w:ascii="Calibri" w:hAnsi="Calibri" w:eastAsia="Calibri"/>
+                <w:b w:val="0"/>
+                <w:sz w:val="18"/>
+              </w:rPr>
+              <w:t>Power rating — max charge MW and max discharge MW in every hour</w:t>
+            </w:r>
+          </w:p>
+        </w:tc>
+      </w:tr>
+      <w:tr>
+        <w:tc>
+          <w:tcPr>
+            <w:tcW w:type="dxa" w:w="3168"/>
+          </w:tcPr>
+          <w:p>
+            <w:r>
+              <w:rPr>
+                <w:rFonts w:ascii="Calibri" w:hAnsi="Calibri" w:eastAsia="Calibri"/>
+                <w:b w:val="0"/>
+                <w:sz w:val="18"/>
+              </w:rPr>
+              <w:t>energy_mwh</w:t>
+            </w:r>
+          </w:p>
+        </w:tc>
+        <w:tc>
+          <w:tcPr>
+            <w:tcW w:type="dxa" w:w="6192"/>
+          </w:tcPr>
+          <w:p>
+            <w:r>
+              <w:rPr>
+                <w:rFonts w:ascii="Calibri" w:hAnsi="Calibri" w:eastAsia="Calibri"/>
+                <w:b w:val="0"/>
+                <w:sz w:val="18"/>
+              </w:rPr>
+              <w:t>Energy capacity used with SOC % limits</w:t>
+            </w:r>
+          </w:p>
+        </w:tc>
+      </w:tr>
+      <w:tr>
+        <w:tc>
+          <w:tcPr>
+            <w:tcW w:type="dxa" w:w="3168"/>
+          </w:tcPr>
+          <w:p>
+            <w:r>
+              <w:rPr>
+                <w:rFonts w:ascii="Calibri" w:hAnsi="Calibri" w:eastAsia="Calibri"/>
+                <w:b w:val="0"/>
+                <w:sz w:val="18"/>
+              </w:rPr>
+              <w:t>initial_soc_pct / min_soc_pct / max_soc_pct</w:t>
+            </w:r>
+          </w:p>
+        </w:tc>
+        <w:tc>
+          <w:tcPr>
+            <w:tcW w:type="dxa" w:w="6192"/>
+          </w:tcPr>
+          <w:p>
+            <w:r>
+              <w:rPr>
+                <w:rFonts w:ascii="Calibri" w:hAnsi="Calibri" w:eastAsia="Calibri"/>
+                <w:b w:val="0"/>
+                <w:sz w:val="18"/>
+              </w:rPr>
+              <w:t>Starting SOC and operating window</w:t>
+            </w:r>
+          </w:p>
+        </w:tc>
+      </w:tr>
+      <w:tr>
+        <w:tc>
+          <w:tcPr>
+            <w:tcW w:type="dxa" w:w="3168"/>
+          </w:tcPr>
+          <w:p>
+            <w:r>
+              <w:rPr>
+                <w:rFonts w:ascii="Calibri" w:hAnsi="Calibri" w:eastAsia="Calibri"/>
+                <w:b w:val="0"/>
+                <w:sz w:val="18"/>
+              </w:rPr>
+              <w:t>calendar_degradation_pct / cycle_degradation_pct</w:t>
+            </w:r>
+          </w:p>
+        </w:tc>
+        <w:tc>
+          <w:tcPr>
+            <w:tcW w:type="dxa" w:w="6192"/>
+          </w:tcPr>
+          <w:p>
+            <w:r>
+              <w:rPr>
+                <w:rFonts w:ascii="Calibri" w:hAnsi="Calibri" w:eastAsia="Calibri"/>
+                <w:b w:val="0"/>
+                <w:sz w:val="18"/>
+              </w:rPr>
+              <w:t>Multi-year fade (financial / availability framing)</w:t>
+            </w:r>
+          </w:p>
+        </w:tc>
+      </w:tr>
+      <w:tr>
+        <w:tc>
+          <w:tcPr>
+            <w:tcW w:type="dxa" w:w="3168"/>
+          </w:tcPr>
+          <w:p>
+            <w:r>
+              <w:rPr>
+                <w:rFonts w:ascii="Calibri" w:hAnsi="Calibri" w:eastAsia="Calibri"/>
+                <w:b w:val="0"/>
+                <w:sz w:val="18"/>
+              </w:rPr>
+              <w:t>capex / opex / life / replacement_*</w:t>
+            </w:r>
+          </w:p>
+        </w:tc>
+        <w:tc>
+          <w:tcPr>
+            <w:tcW w:type="dxa" w:w="6192"/>
+          </w:tcPr>
+          <w:p>
+            <w:r>
+              <w:rPr>
+                <w:rFonts w:ascii="Calibri" w:hAnsi="Calibri" w:eastAsia="Calibri"/>
+                <w:b w:val="0"/>
+                <w:sz w:val="18"/>
+              </w:rPr>
+              <w:t>Economics of the battery</w:t>
+            </w:r>
+          </w:p>
+        </w:tc>
+      </w:tr>
+      <w:tr>
+        <w:tc>
+          <w:tcPr>
+            <w:tcW w:type="dxa" w:w="3168"/>
+          </w:tcPr>
+          <w:p>
+            <w:r>
+              <w:rPr>
+                <w:rFonts w:ascii="Calibri" w:hAnsi="Calibri" w:eastAsia="Calibri"/>
+                <w:b w:val="0"/>
+                <w:sz w:val="18"/>
+              </w:rPr>
+              <w:t>allow_grid_charge</w:t>
+            </w:r>
+          </w:p>
+        </w:tc>
+        <w:tc>
+          <w:tcPr>
+            <w:tcW w:type="dxa" w:w="6192"/>
+          </w:tcPr>
+          <w:p>
+            <w:r>
+              <w:rPr>
+                <w:rFonts w:ascii="Calibri" w:hAnsi="Calibri" w:eastAsia="Calibri"/>
+                <w:b w:val="0"/>
+                <w:sz w:val="18"/>
+              </w:rPr>
+              <w:t>If true, grid may charge BESS after load is met</w:t>
+            </w:r>
+          </w:p>
+        </w:tc>
+      </w:tr>
+    </w:tbl>
+    <w:p/>
+    <w:p>
+      <w:pPr>
+        <w:spacing w:after="120"/>
+      </w:pPr>
+      <w:r>
+        <w:rPr>
+          <w:rFonts w:ascii="Calibri" w:hAnsi="Calibri" w:eastAsia="Calibri"/>
+          <w:b/>
+          <w:i w:val="0"/>
+          <w:sz w:val="22"/>
+        </w:rPr>
+        <w:t>Removed from BESS (no longer in UI or model inputs):</w:t>
+      </w:r>
+    </w:p>
+    <w:p>
+      <w:pPr>
+        <w:pStyle w:val="ListBullet"/>
+      </w:pPr>
+      <w:r>
+        <w:rPr>
+          <w:rFonts w:ascii="Calibri" w:hAnsi="Calibri" w:eastAsia="Calibri"/>
+          <w:b w:val="0"/>
+          <w:sz w:val="22"/>
+        </w:rPr>
+        <w:t>charge_efficiency_pct — was one-way charge efficiency; now fixed at 100%.</w:t>
+      </w:r>
+    </w:p>
+    <w:p>
+      <w:pPr>
+        <w:pStyle w:val="ListBullet"/>
+      </w:pPr>
+      <w:r>
+        <w:rPr>
+          <w:rFonts w:ascii="Calibri" w:hAnsi="Calibri" w:eastAsia="Calibri"/>
+          <w:b w:val="0"/>
+          <w:sz w:val="22"/>
+        </w:rPr>
+        <w:t>discharge_efficiency_pct — was one-way discharge efficiency; now fixed at 100%.</w:t>
+      </w:r>
+    </w:p>
+    <w:p>
+      <w:pPr>
+        <w:pStyle w:val="ListBullet"/>
+      </w:pPr>
+      <w:r>
+        <w:rPr>
+          <w:rFonts w:ascii="Calibri" w:hAnsi="Calibri" w:eastAsia="Calibri"/>
+          <w:b w:val="0"/>
+          <w:sz w:val="22"/>
+        </w:rPr>
+        <w:t>round_trip_efficiency_pct — was calculated from the two efficiencies; removed.</w:t>
+      </w:r>
+    </w:p>
+    <w:p>
+      <w:pPr>
+        <w:pStyle w:val="ListBullet"/>
+      </w:pPr>
+      <w:r>
+        <w:rPr>
+          <w:rFonts w:ascii="Calibri" w:hAnsi="Calibri" w:eastAsia="Calibri"/>
+          <w:b w:val="0"/>
+          <w:sz w:val="22"/>
+        </w:rPr>
+        <w:t>max_charge_mw / max_discharge_mw — replaced by power_mw for both directions.</w:t>
+      </w:r>
+    </w:p>
+    <w:p>
+      <w:pPr>
+        <w:spacing w:after="120"/>
+      </w:pPr>
+      <w:r>
+        <w:rPr>
+          <w:rFonts w:ascii="Calibri" w:hAnsi="Calibri" w:eastAsia="Calibri"/>
+          <w:b/>
+          <w:i w:val="0"/>
+          <w:sz w:val="22"/>
+        </w:rPr>
         <w:t>Hourly AC power balance (validated):</w:t>
       </w:r>
     </w:p>
@@ -27242,7 +27219,7 @@
           <w:b w:val="0"/>
           <w:sz w:val="22"/>
         </w:rPr>
-        <w:t>Charge from solar/wind increases the matching RE bucket (× η_c); grid charge increases grid-origin.</w:t>
+        <w:t>Charge from solar/wind increases the matching RE bucket 1:1 (η = 100%); grid charge increases grid-origin.</w:t>
       </w:r>
     </w:p>
     <w:p>
@@ -27938,7 +27915,7 @@
                 <w:b w:val="0"/>
                 <w:sz w:val="18"/>
               </w:rPr>
-              <w:t>Σ Charge×(1−η_c) + Σ Discharge×(1/η_d − 1)</w:t>
+              <w:t>0 (ideal conversion; η_c = η_d = 100%)</w:t>
             </w:r>
           </w:p>
         </w:tc>
@@ -30858,7 +30835,7 @@
                 <w:b w:val="0"/>
                 <w:sz w:val="18"/>
               </w:rPr>
-              <w:t>Battery Energy Storage System</w:t>
+              <w:t>Battery Energy Storage System — power_mw caps charge &amp; discharge; ideal 100% conversion</w:t>
             </w:r>
           </w:p>
         </w:tc>
@@ -31877,7 +31854,7 @@
           <w:i w:val="0"/>
           <w:sz w:val="22"/>
         </w:rPr>
-        <w:t>This User Guide was regenerated to match the current product: Create New / Open Existing (.pto.zip) / Save Project, architecture asset selection, per-asset network charges, Additional costs, Compliance only in Project Setup, Chrome-tab launch, Quit App and tab-close shutdown of background processes, single-instance reuse, LAN sharing, on-screen parameter help, compact Lakh/Cr formatting, 8760 Time window controls, and Section 17A detailed calculations (profiles, dispatch, RE/CFE, compliance costs, CAPEX/OPEX/CRF, ₹/kWh, NPV/IRR/payback, incremental vs DISCOM, ledger identities, optimization ranking).</w:t>
+        <w:t>This User Guide was regenerated to match the current product: Create New / Open Existing (.pto.zip) / Save Project, architecture asset selection, per-asset network charges, Additional costs, Compliance only in Project Setup, simplified BESS inputs (power_mw caps charge &amp; discharge; ideal 100% efficiency; removed charge/discharge efficiency and max charge/discharge power), Chrome-tab launch, Quit App and tab-close shutdown of background processes, single-instance reuse, LAN sharing, on-screen parameter help, compact Lakh/Cr formatting, 8760 Time window controls, and Section 17A detailed calculations (profiles, dispatch, RE/CFE, compliance costs, CAPEX/OPEX/CRF, ₹/kWh, NPV/IRR/payback, incremental vs DISCOM, ledger identities, optimization ranking).</w:t>
       </w:r>
     </w:p>
     <w:p>

</xml_diff>